<commit_message>
build_docx: use the Arabic body font for complex script inside code styles so Arabic comments are shaped
Co-Authored-By: Claude Fable 5.1 <noreply@anthropic.com>
Claude-Session: https://claude.ai/code/session_01Y5Ccgz17Pq2brpK5TTSYa7
</commit_message>
<xml_diff>
--- a/deliverables/03-analysis-design/التحليل-والتصميم.docx
+++ b/deliverables/03-analysis-design/التحليل-والتصميم.docx
@@ -12008,7 +12008,15 @@
                 <w:rtl/>
                 <w:szCs w:val="21"/>
               </w:rPr>
-              <w:t xml:space="preserve">الربط بـ127.0.0.1 افتراضياً، و</w:t>
+              <w:t xml:space="preserve">الربط بـ127.0.0.1 افتراضياً، والخيار</w:t>
+            </w:r>
+            <w:r>
+              <w:rPr>
+                <w:sz w:val="21"/>
+                <w:rtl/>
+                <w:szCs w:val="21"/>
+              </w:rPr>
+              <w:t xml:space="preserve"> </w:t>
             </w:r>
             <w:r>
               <w:rPr>
@@ -19004,7 +19012,15 @@
                 <w:rtl/>
                 <w:szCs w:val="22"/>
               </w:rPr>
-              <w:t xml:space="preserve">، وذاكرة الاستجابات، والتسخين، و</w:t>
+              <w:t xml:space="preserve">، وذاكرة الاستجابات، والتسخين، والخيار</w:t>
+            </w:r>
+            <w:r>
+              <w:rPr>
+                <w:sz w:val="22"/>
+                <w:rtl/>
+                <w:szCs w:val="22"/>
+              </w:rPr>
+              <w:t xml:space="preserve"> </w:t>
             </w:r>
             <w:r>
               <w:rPr>
@@ -23178,7 +23194,7 @@
         <w:rPr>
           <w:rtl/>
         </w:rPr>
-        <w:t xml:space="preserve">t ‎&lt;‎ 28 ⇒</w:t>
+        <w:t xml:space="preserve">قبل اليوم 28 يكون</w:t>
       </w:r>
       <w:r>
         <w:rPr>
@@ -23197,7 +23213,7 @@
         <w:rPr>
           <w:rtl/>
         </w:rPr>
-        <w:t xml:space="preserve">؛ وt ‎&lt;‎ 56 ⇒ لا عناقيد.</w:t>
+        <w:t xml:space="preserve">، وقبل اليوم 56 لا عناقيد.</w:t>
       </w:r>
     </w:p>
     <w:p>
@@ -23701,7 +23717,13 @@
         <w:rPr>
           <w:rtl/>
         </w:rPr>
-        <w:t xml:space="preserve">R-D1 E10 مرة واحدة، وأي تشغيل لاحق بـ</w:t>
+        <w:t xml:space="preserve">R-D1 E10 مرة واحدة، وأي تشغيل لاحق بالخيار</w:t>
+      </w:r>
+      <w:r>
+        <w:rPr>
+          <w:rtl/>
+        </w:rPr>
+        <w:t xml:space="preserve"> </w:t>
       </w:r>
       <w:r>
         <w:rPr>
@@ -24550,26 +24572,51 @@
         <w:rPr>
           <w:rtl/>
         </w:rPr>
-        <w:t xml:space="preserve">إلزامي لشبكة عرض معلنة لكل عرض متاح: كل 7 أيام + القطوع {70، 126، 182} + قطوع الخطر {28، 56، 112} (نحو ساعة CPU لعروض 2013)، بأمر دفعي أو بـ</w:t>
+        <w:t xml:space="preserve">إلزامي لشبكة عرض معلنة لكل عرض متاح: كل 7 أيام + القطوع {70، 126، 182} + قطوع الخطر {28، 56، 112} (نحو ساعة CPU لعروض 2013)، بأمر دفعي يستدعي الدالة</w:t>
+      </w:r>
+      <w:r>
+        <w:rPr>
+          <w:rtl/>
+        </w:rPr>
+        <w:t xml:space="preserve"> </w:t>
       </w:r>
       <w:r>
         <w:rPr>
           <w:rStyle w:val="VerbatimChar"/>
           <w:rtl/>
         </w:rPr>
-        <w:t xml:space="preserve">‎--warm</w:t>
-      </w:r>
-      <w:r>
-        <w:rPr>
-          <w:rtl/>
-        </w:rPr>
-        <w:t xml:space="preserve"> </w:t>
-      </w:r>
-      <w:r>
-        <w:rPr>
-          <w:rtl/>
-        </w:rPr>
-        <w:t xml:space="preserve">في خيط خلفي؛ واختياري لكل الأيام.</w:t>
+        <w:t xml:space="preserve">warm()</w:t>
+      </w:r>
+      <w:r>
+        <w:rPr>
+          <w:rtl/>
+        </w:rPr>
+        <w:t xml:space="preserve"> </w:t>
+      </w:r>
+      <w:r>
+        <w:rPr>
+          <w:rtl/>
+        </w:rPr>
+        <w:t xml:space="preserve">في</w:t>
+      </w:r>
+      <w:r>
+        <w:rPr>
+          <w:rtl/>
+        </w:rPr>
+        <w:t xml:space="preserve"> </w:t>
+      </w:r>
+      <w:r>
+        <w:rPr>
+          <w:rStyle w:val="VerbatimChar"/>
+          <w:rtl/>
+        </w:rPr>
+        <w:t xml:space="preserve">serving.py</w:t>
+      </w:r>
+      <w:r>
+        <w:rPr>
+          <w:rtl/>
+        </w:rPr>
+        <w:t xml:space="preserve">؛ واختياري لكل الأيام.</w:t>
       </w:r>
     </w:p>
     <w:p>
@@ -31982,7 +32029,15 @@
                 <w:rtl/>
                 <w:szCs w:val="22"/>
               </w:rPr>
-              <w:t xml:space="preserve">التشغيل بـ</w:t>
+              <w:t xml:space="preserve">التشغيل بالخيار</w:t>
+            </w:r>
+            <w:r>
+              <w:rPr>
+                <w:sz w:val="22"/>
+                <w:rtl/>
+                <w:szCs w:val="22"/>
+              </w:rPr>
+              <w:t xml:space="preserve"> </w:t>
             </w:r>
             <w:r>
               <w:rPr>
@@ -48471,7 +48526,15 @@
                 <w:rtl/>
                 <w:szCs w:val="22"/>
               </w:rPr>
-              <w:t xml:space="preserve">(D-65)؛ وللمدرّس فقط؛ وعتبة ومصدر معلنان؛ و</w:t>
+              <w:t xml:space="preserve">(D-65)؛ وللمدرّس فقط؛ وعتبة ومصدر معلنان؛ والخيار</w:t>
+            </w:r>
+            <w:r>
+              <w:rPr>
+                <w:sz w:val="22"/>
+                <w:rtl/>
+                <w:szCs w:val="22"/>
+              </w:rPr>
+              <w:t xml:space="preserve"> </w:t>
             </w:r>
             <w:r>
               <w:rPr>
@@ -48888,7 +48951,13 @@
         <w:rPr>
           <w:rtl/>
         </w:rPr>
-        <w:t xml:space="preserve">الربط بـ127.0.0.1 افتراضياً، و</w:t>
+        <w:t xml:space="preserve">الربط بـ127.0.0.1 افتراضياً، والخيار</w:t>
+      </w:r>
+      <w:r>
+        <w:rPr>
+          <w:rtl/>
+        </w:rPr>
+        <w:t xml:space="preserve"> </w:t>
       </w:r>
       <w:r>
         <w:rPr>

</xml_diff>

<commit_message>
UI: table heading reflects live sort; drawer learner row highlighted alone (D-72); screenshots 05/06 retaken
Co-Authored-By: Claude Fable 5.1 <noreply@anthropic.com>
Claude-Session: https://claude.ai/code/session_01Y5Ccgz17Pq2brpK5TTSYa7
</commit_message>
<xml_diff>
--- a/deliverables/03-analysis-design/التحليل-والتصميم.docx
+++ b/deliverables/03-analysis-design/التحليل-والتصميم.docx
@@ -303,7 +303,7 @@
         <w:rPr>
           <w:rtl/>
         </w:rPr>
-        <w:t xml:space="preserve">سجل القرارات D-01 إلى D-70، وADR-001 إلى ADR-004 بما فيها ملحق ADR-004 §4-مكرر، ومحضر الاجتماع 03 (</w:t>
+        <w:t xml:space="preserve">سجل القرارات D-01 إلى D-72، وADR-001 إلى ADR-004 بما فيها ملحق ADR-004 §4-مكرر، ومحضر الاجتماع 03 (</w:t>
       </w:r>
       <w:r>
         <w:rPr>
@@ -423,6 +423,26 @@
           <w:rtl/>
         </w:rPr>
         <w:t xml:space="preserve">(درجة الخطر، والفصل، وفتح 2014، وزمن الاستجابة، ونطاق التجميد، ونظافة العقد)، و</w:t>
+      </w:r>
+      <w:r>
+        <w:rPr>
+          <w:rtl/>
+          <w:bCs/>
+          <w:b/>
+        </w:rPr>
+        <w:t xml:space="preserve">D-71 وD-72</w:t>
+      </w:r>
+      <w:r>
+        <w:rPr>
+          <w:rtl/>
+        </w:rPr>
+        <w:t xml:space="preserve"> </w:t>
+      </w:r>
+      <w:r>
+        <w:rPr>
+          <w:rtl/>
+        </w:rPr>
+        <w:t xml:space="preserve">(مؤشرات لوحة المدرّس الوصفية، ولقطات المتعلم الفرد؛ محضر الاجتماع 05)، و</w:t>
       </w:r>
       <w:r>
         <w:rPr>
@@ -7498,7 +7518,7 @@
                 <w:rtl/>
                 <w:szCs w:val="22"/>
               </w:rPr>
-              <w:t xml:space="preserve">نظرة المدرّس العامة: التسجيلات، والنشطون في آخر 7 أيام، والكتالوج عند t، ووسيط الأيام النشطة، والتقييمات القادمة، وأعلى الموارد، وفئات درجة الخطر</w:t>
+              <w:t xml:space="preserve">نظرة المدرّس العامة: التسجيلات، والنشطون في آخر 7 أيام، و«اتساع التوصيات عند اليوم t: X من Y مورداً» (وصف لا مقياس تقييم، بلا اسم Coverage@10، D-71)، ووسيط الأيام النشطة، والتقييمات القادمة، وأعلى الموارد، وفئات درجة الخطر</w:t>
             </w:r>
           </w:p>
         </w:tc>
@@ -7536,7 +7556,7 @@
                 <w:rtl/>
                 <w:szCs w:val="22"/>
               </w:rPr>
-              <w:t xml:space="preserve">ADR-003 §3.3</w:t>
+              <w:t xml:space="preserve">ADR-003 §3.3، D-71</w:t>
             </w:r>
           </w:p>
         </w:tc>
@@ -7576,7 +7596,7 @@
                 <w:rtl/>
                 <w:szCs w:val="22"/>
               </w:rPr>
-              <w:t xml:space="preserve">عناقيد اليوم 56 (k، والاستقرار، والأحجام، والمراكز، ووصف عربي مولَّد بقاعدة)، وتُعرض عند t ‎≥‎ 56</w:t>
+              <w:t xml:space="preserve">عناقيد اليوم 56 (k، والاستقرار، والأحجام، والمراكز، ووصف عربي مولَّد بقاعدة)، وتُعرض عند t ‎≥‎ 56، ومعها «تشخيص التجميع (مؤشرات داخلية بلا تسميات)»: silhouette وDBI وARI بمصدره، وARI «غير متاح» إن غاب (D-71)</w:t>
             </w:r>
           </w:p>
         </w:tc>
@@ -7614,7 +7634,7 @@
                 <w:rtl/>
                 <w:szCs w:val="22"/>
               </w:rPr>
-              <w:t xml:space="preserve">D-13، D-39</w:t>
+              <w:t xml:space="preserve">D-13، D-39، D-71</w:t>
             </w:r>
           </w:p>
         </w:tc>
@@ -9228,11 +9248,11 @@
         </w:tblBorders>
       </w:tblPr>
       <w:tblGrid>
-        <w:gridCol w:w="675"/>
-        <w:gridCol w:w="675"/>
-        <w:gridCol w:w="5218"/>
-        <w:gridCol w:w="675"/>
-        <w:gridCol w:w="675"/>
+        <w:gridCol w:w="670"/>
+        <w:gridCol w:w="670"/>
+        <w:gridCol w:w="5239"/>
+        <w:gridCol w:w="670"/>
+        <w:gridCol w:w="670"/>
       </w:tblGrid>
       <w:tr>
         <w:trPr>
@@ -10828,7 +10848,7 @@
                 <w:rtl/>
                 <w:szCs w:val="21"/>
               </w:rPr>
-              <w:t xml:space="preserve">data/cache/serving/</w:t>
+              <w:t xml:space="preserve">data/cache/serving_clusters/</w:t>
             </w:r>
             <w:r>
               <w:rPr>
@@ -15255,7 +15275,7 @@
         <w:rPr>
           <w:rtl/>
         </w:rPr>
-        <w:t xml:space="preserve">تعرض اللوحة خمس بطاقات (التسجيلات، والنشطون في آخر 7 أيام، والكتالوج عند t، ووسيط الأيام النشطة، و</w:t>
+        <w:t xml:space="preserve">تعرض اللوحة خمس بطاقات (التسجيلات، والنشطون في آخر 7 أيام، و«اتساع التوصيات عند اليوم t: X من Y مورداً» بلا اسم Coverage@10 (D-71)، ووسيط الأيام النشطة، و</w:t>
       </w:r>
       <w:r>
         <w:rPr>
@@ -18556,7 +18576,7 @@
                 <w:rtl/>
                 <w:szCs w:val="22"/>
               </w:rPr>
-              <w:t xml:space="preserve">data/cache/serving/</w:t>
+              <w:t xml:space="preserve">data/cache/serving_clusters/</w:t>
             </w:r>
           </w:p>
         </w:tc>
@@ -21168,7 +21188,7 @@
           <w:rStyle w:val="VerbatimChar"/>
           <w:rtl/>
         </w:rPr>
-        <w:t xml:space="preserve">data/cache/serving/</w:t>
+        <w:t xml:space="preserve">data/cache/serving_clusters/</w:t>
       </w:r>
       <w:r>
         <w:rPr>
@@ -24424,7 +24444,7 @@
           <w:rStyle w:val="VerbatimChar"/>
           <w:rtl/>
         </w:rPr>
-        <w:t xml:space="preserve">data/cache/serving/‎&lt;‎presentation‎&gt;‎/‎&lt;‎t‎&gt;‎.npz</w:t>
+        <w:t xml:space="preserve">data/cache/serving_clusters/‎&lt;‎presentation‎&gt;‎_‎&lt;‎t‎&gt;‎.npz</w:t>
       </w:r>
       <w:r>
         <w:rPr>
@@ -26556,7 +26576,7 @@
                 <w:rtl/>
                 <w:szCs w:val="22"/>
               </w:rPr>
-              <w:t xml:space="preserve">data/cache/serving/‎&lt;‎pres‎&gt;‎/‎&lt;‎day‎&gt;‎.npz</w:t>
+              <w:t xml:space="preserve">data/cache/serving_clusters/‎&lt;‎pres‎&gt;‎_‎&lt;‎day‎&gt;‎.npz</w:t>
             </w:r>
             <w:r>
               <w:rPr>
@@ -28435,7 +28455,7 @@
           <w:rStyle w:val="VerbatimChar"/>
           <w:rtl/>
         </w:rPr>
-        <w:t xml:space="preserve">data/cache/serving/&lt;presentation&gt;/&lt;day&gt;.npz     # git-ignored; cluster_choice memo (D-68)</w:t>
+        <w:t xml:space="preserve">data/cache/serving_clusters/&lt;pres&gt;_&lt;day&gt;.npz       # git-ignored; cluster_choice memo (D-68)</w:t>
       </w:r>
     </w:p>
     <w:p>
@@ -31789,9 +31809,9 @@
         </w:tblBorders>
       </w:tblPr>
       <w:tblGrid>
-        <w:gridCol w:w="1070"/>
-        <w:gridCol w:w="3496"/>
-        <w:gridCol w:w="3353"/>
+        <w:gridCol w:w="1060"/>
+        <w:gridCol w:w="3465"/>
+        <w:gridCol w:w="3394"/>
       </w:tblGrid>
       <w:tr>
         <w:trPr>
@@ -35576,10 +35596,10 @@
         </w:tblBorders>
       </w:tblPr>
       <w:tblGrid>
-        <w:gridCol w:w="833"/>
-        <w:gridCol w:w="2362"/>
-        <w:gridCol w:w="3890"/>
-        <w:gridCol w:w="833"/>
+        <w:gridCol w:w="812"/>
+        <w:gridCol w:w="1624"/>
+        <w:gridCol w:w="4670"/>
+        <w:gridCol w:w="812"/>
       </w:tblGrid>
       <w:tr>
         <w:trPr>
@@ -36090,7 +36110,57 @@
                 <w:rtl/>
                 <w:szCs w:val="22"/>
               </w:rPr>
-              <w:t xml:space="preserve">الأحجام، والمراكز بمقياس z، ووصف حتمي من أعلى ملمحين، وPCA بـSVD على عيّنة حتى 500 نقطة</w:t>
+              <w:t xml:space="preserve">الأحجام، والمراكز بمقياس z، ووصف حتمي من أعلى ملمحين، وPCA بـSVD على عيّنة حتى 500 نقطة؛ وتشخيص التجميع (silhouette، وDBI، و</w:t>
+            </w:r>
+            <w:r>
+              <w:rPr>
+                <w:rStyle w:val="VerbatimChar"/>
+                <w:sz w:val="22"/>
+                <w:rtl/>
+                <w:szCs w:val="22"/>
+              </w:rPr>
+              <w:t xml:space="preserve">ari</w:t>
+            </w:r>
+            <w:r>
+              <w:rPr>
+                <w:sz w:val="22"/>
+                <w:rtl/>
+                <w:szCs w:val="22"/>
+              </w:rPr>
+              <w:t xml:space="preserve"> </w:t>
+            </w:r>
+            <w:r>
+              <w:rPr>
+                <w:sz w:val="22"/>
+                <w:rtl/>
+                <w:szCs w:val="22"/>
+              </w:rPr>
+              <w:t xml:space="preserve">يقبل null فيُعرض «غير متاح»، ومصدره</w:t>
+            </w:r>
+            <w:r>
+              <w:rPr>
+                <w:sz w:val="22"/>
+                <w:rtl/>
+                <w:szCs w:val="22"/>
+              </w:rPr>
+              <w:t xml:space="preserve"> </w:t>
+            </w:r>
+            <w:r>
+              <w:rPr>
+                <w:rStyle w:val="VerbatimChar"/>
+                <w:sz w:val="22"/>
+                <w:rtl/>
+                <w:szCs w:val="22"/>
+              </w:rPr>
+              <w:t xml:space="preserve">results/dev2013/learner_clusters.csv</w:t>
+            </w:r>
+            <w:r>
+              <w:rPr>
+                <w:sz w:val="22"/>
+                <w:rtl/>
+                <w:szCs w:val="22"/>
+              </w:rPr>
+              <w:t xml:space="preserve">؛ D-71)</w:t>
             </w:r>
           </w:p>
         </w:tc>
@@ -37215,9 +37285,9 @@
         </w:tblBorders>
       </w:tblPr>
       <w:tblGrid>
-        <w:gridCol w:w="2455"/>
+        <w:gridCol w:w="2534"/>
         <w:gridCol w:w="3168"/>
-        <w:gridCol w:w="2296"/>
+        <w:gridCol w:w="2217"/>
       </w:tblGrid>
       <w:tr>
         <w:trPr>
@@ -38551,7 +38621,7 @@
         <w:rPr>
           <w:rtl/>
         </w:rPr>
-        <w:t xml:space="preserve">ويعرض الشكل 11 لوحة المدرّس: (1) شريط «درجة خطر نسبية (غير معايَرة)، للمدرّس فقط»، و(2) خمس بطاقات مؤشرات منها «فوق العتبة» حصةً عدداً ونسبة، و(3) عناقيد اليوم 56، و(4) مدرج الدرجة بأربع فئات والعتبة 0.4557 (D-58)، و(5) جدول المتعلمين بتصفية «فوق العتبة»، و(6) درج الملف بعوامل</w:t>
+        <w:t xml:space="preserve">ويعرض الشكل 11 لوحة المدرّس: (1) شريط «درجة خطر نسبية (غير معايَرة)، للمدرّس فقط»، و(2) خمس بطاقات مؤشرات منها «اتساع التوصيات عند اليوم t» (D-71) و«فوق العتبة» حصةً عدداً ونسبة، و(3) عناقيد اليوم 56 وتحتها «تشخيص التجميع (مؤشرات داخلية بلا تسميات)» بمصدر ARI (D-71)، و(4) مدرج الدرجة بأربع فئات والعتبة 0.4557 (D-58)، و(5) جدول المتعلمين، و(6) درج الملف بعوامل</w:t>
       </w:r>
       <w:r>
         <w:rPr>
@@ -38583,7 +38653,7 @@
         <w:rPr>
           <w:rtl/>
         </w:rPr>
-        <w:t xml:space="preserve">(الموجب يرفع الدرجة).</w:t>
+        <w:t xml:space="preserve">(الموجب يرفع الدرجة). والصف المحدد ومتعلم الدرج درجته متوسطة دون العتبة، والجدول مفروز بغير الخطر وبلا مرشّح «فوق العتبة» مفعَّل، كما يشترط D-72 في كل لقطة تُظهر متعلماً فرداً مع درجته؛ ولا رمز قرار في نصوص المستخدم (محضر الاجتماع 05).</w:t>
       </w:r>
     </w:p>
     <w:p>
@@ -47860,9 +47930,9 @@
         </w:tblBorders>
       </w:tblPr>
       <w:tblGrid>
-        <w:gridCol w:w="2316"/>
+        <w:gridCol w:w="2241"/>
         <w:gridCol w:w="1120"/>
-        <w:gridCol w:w="4483"/>
+        <w:gridCol w:w="4557"/>
       </w:tblGrid>
       <w:tr>
         <w:trPr>
@@ -50496,7 +50566,7 @@
       <w:jc w:val="left"/>
     </w:pPr>
     <w:rPr>
-      <w:rFonts w:ascii="Consolas" w:hAnsi="Consolas" w:cs="Consolas" w:eastAsia="Consolas"/>
+      <w:rFonts w:ascii="Consolas" w:hAnsi="Consolas" w:cs="Simplified Arabic" w:eastAsia="Consolas"/>
       <w:sz w:val="22"/>
     </w:rPr>
   </w:style>
@@ -50561,7 +50631,7 @@
       <w:jc w:val="left"/>
     </w:pPr>
     <w:rPr>
-      <w:rFonts w:ascii="Consolas" w:hAnsi="Consolas" w:cs="Consolas" w:eastAsia="Consolas"/>
+      <w:rFonts w:ascii="Consolas" w:hAnsi="Consolas" w:cs="Simplified Arabic" w:eastAsia="Consolas"/>
     </w:rPr>
   </w:style>
   <w:style w:type="character" w:customStyle="1" w:styleId="KeywordTok">

</xml_diff>

<commit_message>
Design doc: C7 naming (internal C7_ClusterPop, API similar_pop); Word rebuilt
Co-Authored-By: Claude Fable 5.1 <noreply@anthropic.com>
Claude-Session: https://claude.ai/code/session_01Y5Ccgz17Pq2brpK5TTSYa7
</commit_message>
<xml_diff>
--- a/deliverables/03-analysis-design/التحليل-والتصميم.docx
+++ b/deliverables/03-analysis-design/التحليل-والتصميم.docx
@@ -27616,6 +27616,39 @@
                 <w:b/>
                 <w:szCs w:val="22"/>
               </w:rPr>
+              <w:t xml:space="preserve">C7</w:t>
+            </w:r>
+            <w:r>
+              <w:rPr>
+                <w:sz w:val="22"/>
+                <w:rtl/>
+                <w:szCs w:val="22"/>
+              </w:rPr>
+              <w:t xml:space="preserve"> </w:t>
+            </w:r>
+            <w:r>
+              <w:rPr>
+                <w:sz w:val="22"/>
+                <w:rtl/>
+                <w:szCs w:val="22"/>
+              </w:rPr>
+              <w:t xml:space="preserve">(في HYB*): يُسمّى داخلياً</w:t>
+            </w:r>
+            <w:r>
+              <w:rPr>
+                <w:sz w:val="22"/>
+                <w:rtl/>
+                <w:szCs w:val="22"/>
+              </w:rPr>
+              <w:t xml:space="preserve"> </w:t>
+            </w:r>
+            <w:r>
+              <w:rPr>
+                <w:rStyle w:val="VerbatimChar"/>
+                <w:sz w:val="22"/>
+                <w:rtl/>
+                <w:szCs w:val="22"/>
+              </w:rPr>
               <w:t xml:space="preserve">C7_ClusterPop</w:t>
             </w:r>
             <w:r>
@@ -27632,7 +27665,7 @@
                 <w:rtl/>
                 <w:szCs w:val="22"/>
               </w:rPr>
-              <w:t xml:space="preserve">(في HYB*؛</w:t>
+              <w:t xml:space="preserve">ويُعرض عبر API باسم</w:t>
             </w:r>
             <w:r>
               <w:rPr>
@@ -27649,23 +27682,7 @@
                 <w:rtl/>
                 <w:szCs w:val="22"/>
               </w:rPr>
-              <w:t xml:space="preserve">C7_SimilarPop</w:t>
-            </w:r>
-            <w:r>
-              <w:rPr>
-                <w:sz w:val="22"/>
-                <w:rtl/>
-                <w:szCs w:val="22"/>
-              </w:rPr>
-              <w:t xml:space="preserve"> </w:t>
-            </w:r>
-            <w:r>
-              <w:rPr>
-                <w:sz w:val="22"/>
-                <w:rtl/>
-                <w:szCs w:val="22"/>
-              </w:rPr>
-              <w:t xml:space="preserve">في عقود المتعلم)</w:t>
+              <w:t xml:space="preserve">similar_pop</w:t>
             </w:r>
           </w:p>
         </w:tc>
@@ -28861,7 +28878,7 @@
         <w:rPr>
           <w:rtl/>
         </w:rPr>
-        <w:t xml:space="preserve">(D-70)، والمعرّف العام</w:t>
+        <w:t xml:space="preserve">(D-70)، ومعرّف المكوّن (7)</w:t>
       </w:r>
       <w:r>
         <w:rPr>
@@ -28874,113 +28891,19 @@
           <w:rStyle w:val="VerbatimChar"/>
           <w:rtl/>
         </w:rPr>
-        <w:t xml:space="preserve">C7_SimilarPop</w:t>
-      </w:r>
-      <w:r>
-        <w:rPr>
-          <w:rtl/>
-        </w:rPr>
-        <w:t xml:space="preserve"> </w:t>
-      </w:r>
-      <w:r>
-        <w:rPr>
-          <w:rtl/>
-        </w:rPr>
-        <w:t xml:space="preserve">بتسمية «شعبية لدى المتشابهين (7)» بدل</w:t>
-      </w:r>
-      <w:r>
-        <w:rPr>
-          <w:rtl/>
-        </w:rPr>
-        <w:t xml:space="preserve"> </w:t>
-      </w:r>
-      <w:r>
-        <w:rPr>
-          <w:rStyle w:val="VerbatimChar"/>
-          <w:rtl/>
-        </w:rPr>
-        <w:t xml:space="preserve">C7_ClusterPop</w:t>
-      </w:r>
-      <w:r>
-        <w:rPr>
-          <w:rtl/>
-        </w:rPr>
-        <w:t xml:space="preserve"> </w:t>
-      </w:r>
-      <w:r>
-        <w:rPr>
-          <w:rtl/>
-        </w:rPr>
-        <w:t xml:space="preserve">في عقود المتعلم وحدها، لأن اختبار D-70 يرفض أي مفتاح أو قيمة نصية تحتوي «cluster»؛ ويحوّله</w:t>
-      </w:r>
-      <w:r>
-        <w:rPr>
-          <w:rtl/>
-        </w:rPr>
-        <w:t xml:space="preserve"> </w:t>
-      </w:r>
-      <w:r>
-        <w:rPr>
-          <w:rStyle w:val="VerbatimChar"/>
-          <w:rtl/>
-        </w:rPr>
-        <w:t xml:space="preserve">schemas.py</w:t>
-      </w:r>
-      <w:r>
-        <w:rPr>
-          <w:rtl/>
-        </w:rPr>
-        <w:t xml:space="preserve">، ويبقى</w:t>
-      </w:r>
-      <w:r>
-        <w:rPr>
-          <w:rtl/>
-        </w:rPr>
-        <w:t xml:space="preserve"> </w:t>
-      </w:r>
-      <w:r>
-        <w:rPr>
-          <w:rStyle w:val="VerbatimChar"/>
-          <w:rtl/>
-        </w:rPr>
-        <w:t xml:space="preserve">C7_ClusterPop</w:t>
-      </w:r>
-      <w:r>
-        <w:rPr>
-          <w:rtl/>
-        </w:rPr>
-        <w:t xml:space="preserve"> </w:t>
-      </w:r>
-      <w:r>
-        <w:rPr>
-          <w:rtl/>
-        </w:rPr>
-        <w:t xml:space="preserve">في</w:t>
-      </w:r>
-      <w:r>
-        <w:rPr>
-          <w:rtl/>
-        </w:rPr>
-        <w:t xml:space="preserve"> </w:t>
-      </w:r>
-      <w:r>
-        <w:rPr>
-          <w:rStyle w:val="VerbatimChar"/>
-          <w:rtl/>
-        </w:rPr>
-        <w:t xml:space="preserve">serving</w:t>
-      </w:r>
-      <w:r>
-        <w:rPr>
-          <w:rtl/>
-        </w:rPr>
-        <w:t xml:space="preserve"> </w:t>
-      </w:r>
-      <w:r>
-        <w:rPr>
-          <w:rtl/>
-        </w:rPr>
-        <w:t xml:space="preserve">وعقود المدرّس.</w:t>
+        <w:t xml:space="preserve">similar_pop</w:t>
+      </w:r>
+      <w:r>
+        <w:rPr>
+          <w:rtl/>
+        </w:rPr>
+        <w:t xml:space="preserve"> </w:t>
+      </w:r>
+      <w:r>
+        <w:rPr>
+          <w:rtl/>
+        </w:rPr>
+        <w:t xml:space="preserve">بوسم «شعبية الأنماط المشابهة» في عقود المتعلم (D-70).</w:t>
       </w:r>
     </w:p>
     <w:p>
@@ -32959,7 +32882,7 @@
         <w:rPr>
           <w:rStyle w:val="StringTok"/>
         </w:rPr>
-        <w:t xml:space="preserve">"C7_SimilarPop"</w:t>
+        <w:t xml:space="preserve">"similar_pop"</w:t>
       </w:r>
       <w:r>
         <w:rPr>
@@ -32995,7 +32918,7 @@
         <w:rPr>
           <w:rStyle w:val="StringTok"/>
         </w:rPr>
-        <w:t xml:space="preserve">"شعبية لدى المتشابهين (7)"</w:t>
+        <w:t xml:space="preserve">"شعبية الأنماط المشابهة"</w:t>
       </w:r>
       <w:r>
         <w:rPr>
@@ -33361,7 +33284,7 @@
         <w:rPr>
           <w:rStyle w:val="DataTypeTok"/>
         </w:rPr>
-        <w:t xml:space="preserve">"C7_SimilarPop"</w:t>
+        <w:t xml:space="preserve">"similar_pop"</w:t>
       </w:r>
       <w:r>
         <w:rPr>
@@ -33769,7 +33692,7 @@
         <w:rPr>
           <w:rStyle w:val="StringTok"/>
         </w:rPr>
-        <w:t xml:space="preserve">"C7_SimilarPop"</w:t>
+        <w:t xml:space="preserve">"similar_pop"</w:t>
       </w:r>
       <w:r>
         <w:rPr>

</xml_diff>

<commit_message>
Design doc v2.2: supervisor's four corrections (threshold precision, provenance.model_cut everywhere, examples, test counts) and D-74 sentence; Word rebuilt
Co-Authored-By: Claude Fable 5.1 <noreply@anthropic.com>
Claude-Session: https://claude.ai/code/session_01Y5Ccgz17Pq2brpK5TTSYa7
</commit_message>
<xml_diff>
--- a/deliverables/03-analysis-design/التحليل-والتصميم.docx
+++ b/deliverables/03-analysis-design/التحليل-والتصميم.docx
@@ -635,7 +635,7 @@
           <w:bCs/>
           <w:b/>
         </w:rPr>
-        <w:t xml:space="preserve">96 اختبار وحدة</w:t>
+        <w:t xml:space="preserve">106 اختبارات وحدة</w:t>
       </w:r>
       <w:r>
         <w:rPr>
@@ -666,7 +666,7 @@
         <w:rPr>
           <w:rtl/>
         </w:rPr>
-        <w:t xml:space="preserve">؛ ونسخة أولى من الخلفية</w:t>
+        <w:t xml:space="preserve">؛ والخلفية</w:t>
       </w:r>
       <w:r>
         <w:rPr>
@@ -691,7 +691,7 @@
         <w:rPr>
           <w:rtl/>
         </w:rPr>
-        <w:t xml:space="preserve">(34 اختباراً)؛ وواجهة</w:t>
+        <w:t xml:space="preserve">(52 اختباراً)؛ وواجهة</w:t>
       </w:r>
       <w:r>
         <w:rPr>
@@ -19474,7 +19474,7 @@
           <w:bCs/>
           <w:b/>
         </w:rPr>
-        <w:t xml:space="preserve">كما هو (نسخة أولى، 34 اختباراً):</w:t>
+        <w:t xml:space="preserve">كما هو (52 اختباراً):</w:t>
       </w:r>
       <w:r>
         <w:rPr>
@@ -23412,7 +23412,7 @@
         <w:rPr>
           <w:rtl/>
         </w:rPr>
-        <w:t xml:space="preserve">، وتنقل الواجهة الشريط إليه؛ فقطع الخطر 28 لا يظهر في اللوحة اليوم.</w:t>
+        <w:t xml:space="preserve">، وتنقل الواجهة الشريط إليه؛ قطع الخطر 28 معرَّف (D-65) ومبني، ولا يُعرض لأن اللوحة تبدأ من أول لقطة عناقيد (56). فالقطوع المعروضة 56 و112 (D-74).</w:t>
       </w:r>
     </w:p>
     <w:p>
@@ -27360,7 +27360,24 @@
                 <w:rtl/>
                 <w:szCs w:val="22"/>
               </w:rPr>
-              <w:t xml:space="preserve">)، والعتبة مقرَّبة إلى 3 منازل؛ و</w:t>
+              <w:t xml:space="preserve">)، والعتبة تُرسل بست منازل (</w:t>
+            </w:r>
+            <w:r>
+              <w:rPr>
+                <w:rStyle w:val="VerbatimChar"/>
+                <w:sz w:val="22"/>
+                <w:rtl/>
+                <w:szCs w:val="22"/>
+              </w:rPr>
+              <w:t xml:space="preserve">‎_round(…, 6)‎</w:t>
+            </w:r>
+            <w:r>
+              <w:rPr>
+                <w:sz w:val="22"/>
+                <w:rtl/>
+                <w:szCs w:val="22"/>
+              </w:rPr>
+              <w:t xml:space="preserve">) والتقريب للعرض في الواجهة؛ و</w:t>
             </w:r>
             <w:r>
               <w:rPr>
@@ -32068,7 +32085,7 @@
                 <w:rtl/>
                 <w:szCs w:val="22"/>
               </w:rPr>
-              <w:t xml:space="preserve">‎model_cut‎</w:t>
+              <w:t xml:space="preserve">‎provenance.model_cut‎</w:t>
             </w:r>
             <w:r>
               <w:rPr>
@@ -32084,7 +32101,7 @@
                 <w:rtl/>
                 <w:szCs w:val="22"/>
               </w:rPr>
-              <w:t xml:space="preserve">فيه ينتظر البند 7 من 8.4 (غير موجود بعد في</w:t>
+              <w:t xml:space="preserve">في</w:t>
             </w:r>
             <w:r>
               <w:rPr>
@@ -32102,6 +32119,31 @@
                 <w:szCs w:val="22"/>
               </w:rPr>
               <w:t xml:space="preserve">‎InstructorLearnerDetail‎</w:t>
+            </w:r>
+            <w:r>
+              <w:rPr>
+                <w:sz w:val="22"/>
+                <w:rtl/>
+                <w:szCs w:val="22"/>
+              </w:rPr>
+              <w:t xml:space="preserve"> </w:t>
+            </w:r>
+            <w:r>
+              <w:rPr>
+                <w:sz w:val="22"/>
+                <w:rtl/>
+                <w:szCs w:val="22"/>
+              </w:rPr>
+              <w:t xml:space="preserve">كما في كل استجابات البيانات (</w:t>
+            </w:r>
+            <w:r>
+              <w:rPr>
+                <w:rStyle w:val="VerbatimChar"/>
+                <w:sz w:val="22"/>
+                <w:rtl/>
+                <w:szCs w:val="22"/>
+              </w:rPr>
+              <w:t xml:space="preserve">‎schemas.PROVENANCE_MODELS‎</w:t>
             </w:r>
             <w:r>
               <w:rPr>
@@ -36213,7 +36255,139 @@
         <w:rPr>
           <w:rStyle w:val="FunctionTok"/>
         </w:rPr>
-        <w:t xml:space="preserve">}</w:t>
+        <w:t xml:space="preserve">,</w:t>
+      </w:r>
+      <w:r>
+        <w:rPr>
+          <w:rStyle w:val="NormalTok"/>
+        </w:rPr>
+        <w:t xml:space="preserve"> </w:t>
+      </w:r>
+      <w:r>
+        <w:rPr>
+          <w:rStyle w:val="DataTypeTok"/>
+        </w:rPr>
+        <w:t xml:space="preserve">"provenance"</w:t>
+      </w:r>
+      <w:r>
+        <w:rPr>
+          <w:rStyle w:val="FunctionTok"/>
+        </w:rPr>
+        <w:t xml:space="preserve">:</w:t>
+      </w:r>
+      <w:r>
+        <w:rPr>
+          <w:rStyle w:val="NormalTok"/>
+        </w:rPr>
+        <w:t xml:space="preserve"> </w:t>
+      </w:r>
+      <w:r>
+        <w:rPr>
+          <w:rStyle w:val="FunctionTok"/>
+        </w:rPr>
+        <w:t xml:space="preserve">{</w:t>
+      </w:r>
+      <w:r>
+        <w:rPr>
+          <w:rStyle w:val="DataTypeTok"/>
+        </w:rPr>
+        <w:t xml:space="preserve">"run_id"</w:t>
+      </w:r>
+      <w:r>
+        <w:rPr>
+          <w:rStyle w:val="FunctionTok"/>
+        </w:rPr>
+        <w:t xml:space="preserve">:</w:t>
+      </w:r>
+      <w:r>
+        <w:rPr>
+          <w:rStyle w:val="NormalTok"/>
+        </w:rPr>
+        <w:t xml:space="preserve"> </w:t>
+      </w:r>
+      <w:r>
+        <w:rPr>
+          <w:rStyle w:val="StringTok"/>
+        </w:rPr>
+        <w:t xml:space="preserve">"…"</w:t>
+      </w:r>
+      <w:r>
+        <w:rPr>
+          <w:rStyle w:val="FunctionTok"/>
+        </w:rPr>
+        <w:t xml:space="preserve">,</w:t>
+      </w:r>
+      <w:r>
+        <w:rPr>
+          <w:rStyle w:val="NormalTok"/>
+        </w:rPr>
+        <w:t xml:space="preserve"> </w:t>
+      </w:r>
+      <w:r>
+        <w:rPr>
+          <w:rStyle w:val="DataTypeTok"/>
+        </w:rPr>
+        <w:t xml:space="preserve">"role"</w:t>
+      </w:r>
+      <w:r>
+        <w:rPr>
+          <w:rStyle w:val="FunctionTok"/>
+        </w:rPr>
+        <w:t xml:space="preserve">:</w:t>
+      </w:r>
+      <w:r>
+        <w:rPr>
+          <w:rStyle w:val="NormalTok"/>
+        </w:rPr>
+        <w:t xml:space="preserve"> </w:t>
+      </w:r>
+      <w:r>
+        <w:rPr>
+          <w:rStyle w:val="StringTok"/>
+        </w:rPr>
+        <w:t xml:space="preserve">"dev"</w:t>
+      </w:r>
+      <w:r>
+        <w:rPr>
+          <w:rStyle w:val="FunctionTok"/>
+        </w:rPr>
+        <w:t xml:space="preserve">,</w:t>
+      </w:r>
+      <w:r>
+        <w:rPr>
+          <w:rStyle w:val="NormalTok"/>
+        </w:rPr>
+        <w:t xml:space="preserve"> </w:t>
+      </w:r>
+      <w:r>
+        <w:rPr>
+          <w:rStyle w:val="DataTypeTok"/>
+        </w:rPr>
+        <w:t xml:space="preserve">"model_cut"</w:t>
+      </w:r>
+      <w:r>
+        <w:rPr>
+          <w:rStyle w:val="FunctionTok"/>
+        </w:rPr>
+        <w:t xml:space="preserve">:</w:t>
+      </w:r>
+      <w:r>
+        <w:rPr>
+          <w:rStyle w:val="NormalTok"/>
+        </w:rPr>
+        <w:t xml:space="preserve"> </w:t>
+      </w:r>
+      <w:r>
+        <w:rPr>
+          <w:rStyle w:val="DecValTok"/>
+        </w:rPr>
+        <w:t xml:space="preserve">70</w:t>
+      </w:r>
+      <w:r>
+        <w:rPr>
+          <w:rStyle w:val="FunctionTok"/>
+        </w:rPr>
+        <w:t xml:space="preserve">}}</w:t>
       </w:r>
     </w:p>
     <w:p>
@@ -36723,7 +36897,7 @@
         <w:rPr>
           <w:rStyle w:val="FloatTok"/>
         </w:rPr>
-        <w:t xml:space="preserve">0.456</w:t>
+        <w:t xml:space="preserve">0.455716</w:t>
       </w:r>
       <w:r>
         <w:rPr>
@@ -37500,7 +37674,139 @@
         <w:rPr>
           <w:rStyle w:val="FunctionTok"/>
         </w:rPr>
-        <w:t xml:space="preserve">}</w:t>
+        <w:t xml:space="preserve">,</w:t>
+      </w:r>
+      <w:r>
+        <w:rPr>
+          <w:rStyle w:val="NormalTok"/>
+        </w:rPr>
+        <w:t xml:space="preserve"> </w:t>
+      </w:r>
+      <w:r>
+        <w:rPr>
+          <w:rStyle w:val="DataTypeTok"/>
+        </w:rPr>
+        <w:t xml:space="preserve">"provenance"</w:t>
+      </w:r>
+      <w:r>
+        <w:rPr>
+          <w:rStyle w:val="FunctionTok"/>
+        </w:rPr>
+        <w:t xml:space="preserve">:</w:t>
+      </w:r>
+      <w:r>
+        <w:rPr>
+          <w:rStyle w:val="NormalTok"/>
+        </w:rPr>
+        <w:t xml:space="preserve"> </w:t>
+      </w:r>
+      <w:r>
+        <w:rPr>
+          <w:rStyle w:val="FunctionTok"/>
+        </w:rPr>
+        <w:t xml:space="preserve">{</w:t>
+      </w:r>
+      <w:r>
+        <w:rPr>
+          <w:rStyle w:val="DataTypeTok"/>
+        </w:rPr>
+        <w:t xml:space="preserve">"run_id"</w:t>
+      </w:r>
+      <w:r>
+        <w:rPr>
+          <w:rStyle w:val="FunctionTok"/>
+        </w:rPr>
+        <w:t xml:space="preserve">:</w:t>
+      </w:r>
+      <w:r>
+        <w:rPr>
+          <w:rStyle w:val="NormalTok"/>
+        </w:rPr>
+        <w:t xml:space="preserve"> </w:t>
+      </w:r>
+      <w:r>
+        <w:rPr>
+          <w:rStyle w:val="StringTok"/>
+        </w:rPr>
+        <w:t xml:space="preserve">"…"</w:t>
+      </w:r>
+      <w:r>
+        <w:rPr>
+          <w:rStyle w:val="FunctionTok"/>
+        </w:rPr>
+        <w:t xml:space="preserve">,</w:t>
+      </w:r>
+      <w:r>
+        <w:rPr>
+          <w:rStyle w:val="NormalTok"/>
+        </w:rPr>
+        <w:t xml:space="preserve"> </w:t>
+      </w:r>
+      <w:r>
+        <w:rPr>
+          <w:rStyle w:val="DataTypeTok"/>
+        </w:rPr>
+        <w:t xml:space="preserve">"role"</w:t>
+      </w:r>
+      <w:r>
+        <w:rPr>
+          <w:rStyle w:val="FunctionTok"/>
+        </w:rPr>
+        <w:t xml:space="preserve">:</w:t>
+      </w:r>
+      <w:r>
+        <w:rPr>
+          <w:rStyle w:val="NormalTok"/>
+        </w:rPr>
+        <w:t xml:space="preserve"> </w:t>
+      </w:r>
+      <w:r>
+        <w:rPr>
+          <w:rStyle w:val="StringTok"/>
+        </w:rPr>
+        <w:t xml:space="preserve">"dev"</w:t>
+      </w:r>
+      <w:r>
+        <w:rPr>
+          <w:rStyle w:val="FunctionTok"/>
+        </w:rPr>
+        <w:t xml:space="preserve">,</w:t>
+      </w:r>
+      <w:r>
+        <w:rPr>
+          <w:rStyle w:val="NormalTok"/>
+        </w:rPr>
+        <w:t xml:space="preserve"> </w:t>
+      </w:r>
+      <w:r>
+        <w:rPr>
+          <w:rStyle w:val="DataTypeTok"/>
+        </w:rPr>
+        <w:t xml:space="preserve">"model_cut"</w:t>
+      </w:r>
+      <w:r>
+        <w:rPr>
+          <w:rStyle w:val="FunctionTok"/>
+        </w:rPr>
+        <w:t xml:space="preserve">:</w:t>
+      </w:r>
+      <w:r>
+        <w:rPr>
+          <w:rStyle w:val="NormalTok"/>
+        </w:rPr>
+        <w:t xml:space="preserve"> </w:t>
+      </w:r>
+      <w:r>
+        <w:rPr>
+          <w:rStyle w:val="DecValTok"/>
+        </w:rPr>
+        <w:t xml:space="preserve">70</w:t>
+      </w:r>
+      <w:r>
+        <w:rPr>
+          <w:rStyle w:val="FunctionTok"/>
+        </w:rPr>
+        <w:t xml:space="preserve">}}</w:t>
       </w:r>
     </w:p>
     <w:p>
@@ -37511,7 +37817,7 @@
         <w:rPr>
           <w:rtl/>
         </w:rPr>
-        <w:t xml:space="preserve">والعتبة في العقد مقرَّبة إلى 3 منازل (0.456 من 0.4557 المجمَّدة، D-58). وتضيف</w:t>
+        <w:t xml:space="preserve">والعتبة في العقد بست منازل (عتبة D-58 المجمَّدة 0.4557 مقرَّبةً للعرض)، والتقريب في الواجهة وحدها. وتضيف</w:t>
       </w:r>
       <w:r>
         <w:rPr>
@@ -38880,7 +39186,65 @@
                 <w:rtl/>
                 <w:szCs w:val="22"/>
               </w:rPr>
-              <w:t xml:space="preserve">D-49 (6)</w:t>
+              <w:t xml:space="preserve">D-49 (6)؛ منفَّذ:</w:t>
+            </w:r>
+            <w:r>
+              <w:rPr>
+                <w:sz w:val="22"/>
+                <w:rtl/>
+                <w:szCs w:val="22"/>
+              </w:rPr>
+              <w:t xml:space="preserve"> </w:t>
+            </w:r>
+            <w:r>
+              <w:rPr>
+                <w:rStyle w:val="VerbatimChar"/>
+                <w:sz w:val="22"/>
+                <w:rtl/>
+                <w:szCs w:val="22"/>
+              </w:rPr>
+              <w:t xml:space="preserve">‎provenance.model_cut‎</w:t>
+            </w:r>
+            <w:r>
+              <w:rPr>
+                <w:sz w:val="22"/>
+                <w:rtl/>
+                <w:szCs w:val="22"/>
+              </w:rPr>
+              <w:t xml:space="preserve"> </w:t>
+            </w:r>
+            <w:r>
+              <w:rPr>
+                <w:sz w:val="22"/>
+                <w:rtl/>
+                <w:szCs w:val="22"/>
+              </w:rPr>
+              <w:t xml:space="preserve">في كل استجابات البيانات (التوصية، والتفسير، والسجل، والنظرة العامة، والعناقيد، وصفحة المتعلمين، وملف المتعلم؛</w:t>
+            </w:r>
+            <w:r>
+              <w:rPr>
+                <w:sz w:val="22"/>
+                <w:rtl/>
+                <w:szCs w:val="22"/>
+              </w:rPr>
+              <w:t xml:space="preserve"> </w:t>
+            </w:r>
+            <w:r>
+              <w:rPr>
+                <w:rStyle w:val="VerbatimChar"/>
+                <w:sz w:val="22"/>
+                <w:rtl/>
+                <w:szCs w:val="22"/>
+              </w:rPr>
+              <w:t xml:space="preserve">‎schemas.PROVENANCE_MODELS‎</w:t>
+            </w:r>
+            <w:r>
+              <w:rPr>
+                <w:sz w:val="22"/>
+                <w:rtl/>
+                <w:szCs w:val="22"/>
+              </w:rPr>
+              <w:t xml:space="preserve">)</w:t>
             </w:r>
           </w:p>
         </w:tc>
@@ -42478,7 +42842,7 @@
         <w:rPr>
           <w:rtl/>
         </w:rPr>
-        <w:t xml:space="preserve">، و34 في</w:t>
+        <w:t xml:space="preserve">، و52 في</w:t>
       </w:r>
       <w:r>
         <w:rPr>
@@ -48316,7 +48680,7 @@
                 <w:rtl/>
                 <w:szCs w:val="22"/>
               </w:rPr>
-              <w:t xml:space="preserve">و48 في الخلفية تمر؛ النتائج في</w:t>
+              <w:t xml:space="preserve">و52 في الخلفية تمر؛ النتائج في</w:t>
             </w:r>
             <w:r>
               <w:rPr>

</xml_diff>

<commit_message>
Code documentation: meeting-06 decisions (D-75/D-76 pending implementation, D-77), confirmatory guards as implemented, counts dated
Co-Authored-By: Claude Fable 5.1 <noreply@anthropic.com>
Claude-Session: https://claude.ai/code/session_01Y5Ccgz17Pq2brpK5TTSYa7
</commit_message>
<xml_diff>
--- a/deliverables/03-analysis-design/التحليل-والتصميم.docx
+++ b/deliverables/03-analysis-design/التحليل-والتصميم.docx
@@ -303,7 +303,7 @@
         <w:rPr>
           <w:rtl/>
         </w:rPr>
-        <w:t xml:space="preserve">سجل القرارات D-01 إلى D-72، وADR-001 إلى ADR-004 بما فيها ملحق ADR-004 §4-مكرر، ومحضر الاجتماع 03 (</w:t>
+        <w:t xml:space="preserve">سجل القرارات D-01 إلى D-77، وADR-001 إلى ADR-004 بما فيها ملحق ADR-004 §4-مكرر، ومحضر الاجتماع 03 (</w:t>
       </w:r>
       <w:r>
         <w:rPr>
@@ -811,6 +811,36 @@
           <w:rtl/>
         </w:rPr>
         <w:t xml:space="preserve">.</w:t>
+      </w:r>
+    </w:p>
+    <w:p>
+      <w:pPr>
+        <w:numPr>
+          <w:ilvl w:val="0"/>
+          <w:numId w:val="1001"/>
+        </w:numPr>
+        <w:pStyle w:val="Compact"/>
+        <w:bidi w:val="1"/>
+      </w:pPr>
+      <w:r>
+        <w:rPr>
+          <w:rtl/>
+          <w:bCs/>
+          <w:b/>
+        </w:rPr>
+        <w:t xml:space="preserve">رموز القرارات (D-77):</w:t>
+      </w:r>
+      <w:r>
+        <w:rPr>
+          <w:rtl/>
+        </w:rPr>
+        <w:t xml:space="preserve"> </w:t>
+      </w:r>
+      <w:r>
+        <w:rPr>
+          <w:rtl/>
+        </w:rPr>
+        <w:t xml:space="preserve">الجملة الملزمة تُلزم بنصها، والرمز بين قوسين إحالة داخلية يبقى في هذه الوثيقة والمحاضر وREADME والكود، ويُحذف من نصوص الواجهة ودليل المستخدم، ويُستبدل في الأطروحة بإحالة إلى §4-4-2.</w:t>
       </w:r>
     </w:p>
     <w:bookmarkEnd w:id="20"/>
@@ -3382,11 +3412,11 @@
         </w:tblBorders>
       </w:tblPr>
       <w:tblGrid>
-        <w:gridCol w:w="732"/>
-        <w:gridCol w:w="4192"/>
-        <w:gridCol w:w="732"/>
-        <w:gridCol w:w="732"/>
-        <w:gridCol w:w="1530"/>
+        <w:gridCol w:w="714"/>
+        <w:gridCol w:w="4544"/>
+        <w:gridCol w:w="714"/>
+        <w:gridCol w:w="714"/>
+        <w:gridCol w:w="1233"/>
       </w:tblGrid>
       <w:tr>
         <w:trPr>
@@ -6182,15 +6212,7 @@
                 <w:rtl/>
                 <w:szCs w:val="21"/>
               </w:rPr>
-              <w:t xml:space="preserve">قراءة معرّفات 2014 المحدودة لترشيح تدريب H4-أ، مع سجل وصول في</w:t>
-            </w:r>
-            <w:r>
-              <w:rPr>
-                <w:sz w:val="21"/>
-                <w:rtl/>
-                <w:szCs w:val="21"/>
-              </w:rPr>
-              <w:t xml:space="preserve"> </w:t>
+              <w:t xml:space="preserve">قراءة معرّفات 2014 المحدودة لترشيح تدريب مصنِّفات الخطر على 2013 في أربعة مواضع وحدها (</w:t>
             </w:r>
             <w:r>
               <w:rPr>
@@ -6199,6 +6221,115 @@
                 <w:rtl/>
                 <w:szCs w:val="21"/>
               </w:rPr>
+              <w:t xml:space="preserve">‎learner_analysis‎</w:t>
+            </w:r>
+            <w:r>
+              <w:rPr>
+                <w:sz w:val="21"/>
+                <w:rtl/>
+                <w:szCs w:val="21"/>
+              </w:rPr>
+              <w:t xml:space="preserve">، و</w:t>
+            </w:r>
+            <w:r>
+              <w:rPr>
+                <w:rStyle w:val="VerbatimChar"/>
+                <w:sz w:val="21"/>
+                <w:rtl/>
+                <w:szCs w:val="21"/>
+              </w:rPr>
+              <w:t xml:space="preserve">‎risk_final‎</w:t>
+            </w:r>
+            <w:r>
+              <w:rPr>
+                <w:sz w:val="21"/>
+                <w:rtl/>
+                <w:szCs w:val="21"/>
+              </w:rPr>
+              <w:t xml:space="preserve">، و</w:t>
+            </w:r>
+            <w:r>
+              <w:rPr>
+                <w:rStyle w:val="VerbatimChar"/>
+                <w:sz w:val="21"/>
+                <w:rtl/>
+                <w:szCs w:val="21"/>
+              </w:rPr>
+              <w:t xml:space="preserve">‎run_confirmatory‎</w:t>
+            </w:r>
+            <w:r>
+              <w:rPr>
+                <w:sz w:val="21"/>
+                <w:rtl/>
+                <w:szCs w:val="21"/>
+              </w:rPr>
+              <w:t xml:space="preserve">، و</w:t>
+            </w:r>
+            <w:r>
+              <w:rPr>
+                <w:rStyle w:val="VerbatimChar"/>
+                <w:sz w:val="21"/>
+                <w:rtl/>
+                <w:szCs w:val="21"/>
+              </w:rPr>
+              <w:t xml:space="preserve">‎build_artifacts‎</w:t>
+            </w:r>
+            <w:r>
+              <w:rPr>
+                <w:sz w:val="21"/>
+                <w:rtl/>
+                <w:szCs w:val="21"/>
+              </w:rPr>
+              <w:t xml:space="preserve">)، بمعامل</w:t>
+            </w:r>
+            <w:r>
+              <w:rPr>
+                <w:sz w:val="21"/>
+                <w:rtl/>
+                <w:szCs w:val="21"/>
+              </w:rPr>
+              <w:t xml:space="preserve"> </w:t>
+            </w:r>
+            <w:r>
+              <w:rPr>
+                <w:rStyle w:val="VerbatimChar"/>
+                <w:sz w:val="21"/>
+                <w:rtl/>
+                <w:szCs w:val="21"/>
+              </w:rPr>
+              <w:t xml:space="preserve">‎purpose‎</w:t>
+            </w:r>
+            <w:r>
+              <w:rPr>
+                <w:sz w:val="21"/>
+                <w:rtl/>
+                <w:szCs w:val="21"/>
+              </w:rPr>
+              <w:t xml:space="preserve"> </w:t>
+            </w:r>
+            <w:r>
+              <w:rPr>
+                <w:sz w:val="21"/>
+                <w:rtl/>
+                <w:szCs w:val="21"/>
+              </w:rPr>
+              <w:t xml:space="preserve">إلزامي من قائمة بيضاء يُسجَّل لكل استدعاء في</w:t>
+            </w:r>
+            <w:r>
+              <w:rPr>
+                <w:sz w:val="21"/>
+                <w:rtl/>
+                <w:szCs w:val="21"/>
+              </w:rPr>
+              <w:t xml:space="preserve"> </w:t>
+            </w:r>
+            <w:r>
+              <w:rPr>
+                <w:rStyle w:val="VerbatimChar"/>
+                <w:sz w:val="21"/>
+                <w:rtl/>
+                <w:szCs w:val="21"/>
+              </w:rPr>
               <w:t xml:space="preserve">‎results/access_log.jsonl‎</w:t>
             </w:r>
             <w:r>
@@ -6215,7 +6346,7 @@
                 <w:rtl/>
                 <w:szCs w:val="21"/>
               </w:rPr>
-              <w:t xml:space="preserve">(الزمن، وMD5، والأعمدة، والعدد، وcommit)</w:t>
+              <w:t xml:space="preserve">(مع الزمن، وMD5، والأعمدة، والعدد، وcommit)؛ ويُمنع استعمالها لترشيح صفوف مخدومة أو وسمها، وفي التوصية والعنقدة وتحليل 2014</w:t>
             </w:r>
           </w:p>
         </w:tc>
@@ -6253,7 +6384,7 @@
                 <w:rtl/>
                 <w:szCs w:val="21"/>
               </w:rPr>
-              <w:t xml:space="preserve">D-47</w:t>
+              <w:t xml:space="preserve">D-47، D-76</w:t>
             </w:r>
           </w:p>
         </w:tc>
@@ -24303,6 +24434,226 @@
       <w:r>
         <w:rPr>
           <w:rtl/>
+          <w:bCs/>
+          <w:b/>
+        </w:rPr>
+        <w:t xml:space="preserve">الاستئناف المأذون (D-75):</w:t>
+      </w:r>
+      <w:r>
+        <w:rPr>
+          <w:rtl/>
+        </w:rPr>
+        <w:t xml:space="preserve"> </w:t>
+      </w:r>
+      <w:r>
+        <w:rPr>
+          <w:rtl/>
+        </w:rPr>
+        <w:t xml:space="preserve">يُكتب</w:t>
+      </w:r>
+      <w:r>
+        <w:rPr>
+          <w:rtl/>
+        </w:rPr>
+        <w:t xml:space="preserve"> </w:t>
+      </w:r>
+      <w:r>
+        <w:rPr>
+          <w:rStyle w:val="VerbatimChar"/>
+          <w:rtl/>
+        </w:rPr>
+        <w:t xml:space="preserve">‎LOCK‎</w:t>
+      </w:r>
+      <w:r>
+        <w:rPr>
+          <w:rtl/>
+        </w:rPr>
+        <w:t xml:space="preserve"> </w:t>
+      </w:r>
+      <w:r>
+        <w:rPr>
+          <w:rtl/>
+        </w:rPr>
+        <w:t xml:space="preserve">في آخر الطور 1 ويغطي كل نواتجه (ومنها الأشكال والثانوي). وحارس الشجرة النظيفة يستثني</w:t>
+      </w:r>
+      <w:r>
+        <w:rPr>
+          <w:rtl/>
+        </w:rPr>
+        <w:t xml:space="preserve"> </w:t>
+      </w:r>
+      <w:r>
+        <w:rPr>
+          <w:rStyle w:val="VerbatimChar"/>
+          <w:rtl/>
+        </w:rPr>
+        <w:t xml:space="preserve">‎access_log.jsonl‎</w:t>
+      </w:r>
+      <w:r>
+        <w:rPr>
+          <w:rtl/>
+        </w:rPr>
+        <w:t xml:space="preserve"> </w:t>
+      </w:r>
+      <w:r>
+        <w:rPr>
+          <w:rtl/>
+        </w:rPr>
+        <w:t xml:space="preserve">(بشرط أن تكون نسخة الوسم بادئة حرفية له) و</w:t>
+      </w:r>
+      <w:r>
+        <w:rPr>
+          <w:rStyle w:val="VerbatimChar"/>
+          <w:rtl/>
+        </w:rPr>
+        <w:t xml:space="preserve">‎conf2014_aborted_*‎</w:t>
+      </w:r>
+      <w:r>
+        <w:rPr>
+          <w:rtl/>
+        </w:rPr>
+        <w:t xml:space="preserve">. وبعد تعطل بيئي لا مسار إلا</w:t>
+      </w:r>
+      <w:r>
+        <w:rPr>
+          <w:rtl/>
+        </w:rPr>
+        <w:t xml:space="preserve"> </w:t>
+      </w:r>
+      <w:r>
+        <w:rPr>
+          <w:rStyle w:val="VerbatimChar"/>
+          <w:rtl/>
+        </w:rPr>
+        <w:t xml:space="preserve">‎run_confirmatory --resume‎</w:t>
+      </w:r>
+      <w:r>
+        <w:rPr>
+          <w:rtl/>
+        </w:rPr>
+        <w:t xml:space="preserve">: يتحقق من أن HEAD هو الوسم، ومن البصمات المجمَّدة وسجل البدء؛ فإن غاب</w:t>
+      </w:r>
+      <w:r>
+        <w:rPr>
+          <w:rtl/>
+        </w:rPr>
+        <w:t xml:space="preserve"> </w:t>
+      </w:r>
+      <w:r>
+        <w:rPr>
+          <w:rStyle w:val="VerbatimChar"/>
+          <w:rtl/>
+        </w:rPr>
+        <w:t xml:space="preserve">‎LOCK‎</w:t>
+      </w:r>
+      <w:r>
+        <w:rPr>
+          <w:rtl/>
+        </w:rPr>
+        <w:t xml:space="preserve"> </w:t>
+      </w:r>
+      <w:r>
+        <w:rPr>
+          <w:rtl/>
+        </w:rPr>
+        <w:t xml:space="preserve">نُقل المجلد إلى</w:t>
+      </w:r>
+      <w:r>
+        <w:rPr>
+          <w:rtl/>
+        </w:rPr>
+        <w:t xml:space="preserve"> </w:t>
+      </w:r>
+      <w:r>
+        <w:rPr>
+          <w:rStyle w:val="VerbatimChar"/>
+          <w:rtl/>
+        </w:rPr>
+        <w:t xml:space="preserve">‎conf2014_aborted_‎&lt;‎n‎&gt;‎/‎</w:t>
+      </w:r>
+      <w:r>
+        <w:rPr>
+          <w:rtl/>
+        </w:rPr>
+        <w:t xml:space="preserve"> </w:t>
+      </w:r>
+      <w:r>
+        <w:rPr>
+          <w:rtl/>
+        </w:rPr>
+        <w:t xml:space="preserve">مع SHA-256 دون فتحه وأُعيد الطور 1 كاملاً، وإن وُجد وطابقت بصماته أُعيد الطور 2 كاملاً، وأي اختلاف يوقف الأمر. ويُسجَّل كل استئناف في السجل و</w:t>
+      </w:r>
+      <w:r>
+        <w:rPr>
+          <w:rStyle w:val="VerbatimChar"/>
+          <w:rtl/>
+        </w:rPr>
+        <w:t xml:space="preserve">‎deviations.md‎</w:t>
+      </w:r>
+      <w:r>
+        <w:rPr>
+          <w:rtl/>
+        </w:rPr>
+        <w:t xml:space="preserve"> </w:t>
+      </w:r>
+      <w:r>
+        <w:rPr>
+          <w:rtl/>
+        </w:rPr>
+        <w:t xml:space="preserve">ولا يُعدّ تشغيلاً ثانياً. والخلل البرمجي يُصلح بأصغر تعديل بموافقة المشرف كتابةً، ثم يُوسم</w:t>
+      </w:r>
+      <w:r>
+        <w:rPr>
+          <w:rtl/>
+        </w:rPr>
+        <w:t xml:space="preserve"> </w:t>
+      </w:r>
+      <w:r>
+        <w:rPr>
+          <w:rStyle w:val="VerbatimChar"/>
+          <w:rtl/>
+        </w:rPr>
+        <w:t xml:space="preserve">‎freeze-03.1‎</w:t>
+      </w:r>
+      <w:r>
+        <w:rPr>
+          <w:rtl/>
+        </w:rPr>
+        <w:t xml:space="preserve"> </w:t>
+      </w:r>
+      <w:r>
+        <w:rPr>
+          <w:rtl/>
+        </w:rPr>
+        <w:t xml:space="preserve">ويُعاد الطور 1. ويحاكي التشغيل الجاف ثلاث حالات: انهيار قبل</w:t>
+      </w:r>
+      <w:r>
+        <w:rPr>
+          <w:rtl/>
+        </w:rPr>
+        <w:t xml:space="preserve"> </w:t>
+      </w:r>
+      <w:r>
+        <w:rPr>
+          <w:rStyle w:val="VerbatimChar"/>
+          <w:rtl/>
+        </w:rPr>
+        <w:t xml:space="preserve">‎LOCK‎</w:t>
+      </w:r>
+      <w:r>
+        <w:rPr>
+          <w:rtl/>
+        </w:rPr>
+        <w:t xml:space="preserve">، وانهيار بعده، وتلاعب بملف مقفل (ش7، ش8).</w:t>
+      </w:r>
+    </w:p>
+    <w:p>
+      <w:pPr>
+        <w:bidi w:val="1"/>
+      </w:pPr>
+      <w:r>
+        <w:rPr>
+          <w:rtl/>
         </w:rPr>
         <w:t xml:space="preserve">ويجمع الشكل 7 الخط الزمني لإعادة التشغيل (ما يُحسب عند t وما يؤخذ من c) وحالات إتاحة عروض 2014: محجوب ← مجمَّد ← مقيَّم ← متاح.</w:t>
       </w:r>
@@ -30113,10 +30464,10 @@
         </w:tblBorders>
       </w:tblPr>
       <w:tblGrid>
-        <w:gridCol w:w="1504"/>
-        <w:gridCol w:w="1346"/>
-        <w:gridCol w:w="3880"/>
-        <w:gridCol w:w="1188"/>
+        <w:gridCol w:w="1425"/>
+        <w:gridCol w:w="1267"/>
+        <w:gridCol w:w="4118"/>
+        <w:gridCol w:w="1108"/>
       </w:tblGrid>
       <w:tr>
         <w:trPr>
@@ -38294,10 +38645,10 @@
         </w:tblBorders>
       </w:tblPr>
       <w:tblGrid>
-        <w:gridCol w:w="812"/>
-        <w:gridCol w:w="1624"/>
-        <w:gridCol w:w="4670"/>
-        <w:gridCol w:w="812"/>
+        <w:gridCol w:w="805"/>
+        <w:gridCol w:w="1543"/>
+        <w:gridCol w:w="4765"/>
+        <w:gridCol w:w="805"/>
       </w:tblGrid>
       <w:tr>
         <w:trPr>
@@ -46200,26 +46551,26 @@
                 <w:rtl/>
                 <w:szCs w:val="22"/>
               </w:rPr>
-              <w:t xml:space="preserve">D-47</w:t>
-            </w:r>
-          </w:p>
-        </w:tc>
-        <w:tc>
-          <w:tcPr/>
-          <w:p>
-            <w:pPr>
-              <w:pStyle w:val="Compact"/>
-              <w:bidi w:val="1"/>
-              <w:spacing w:before="20" w:after="20" w:line="240" w:lineRule="auto"/>
-              <w:jc w:val="left"/>
-            </w:pPr>
-            <w:r>
-              <w:rPr>
-                <w:sz w:val="22"/>
-                <w:rtl/>
-                <w:szCs w:val="22"/>
-              </w:rPr>
-              <w:t xml:space="preserve">data.confirmatory_student_ids</w:t>
+              <w:t xml:space="preserve">D-47، D-76</w:t>
+            </w:r>
+          </w:p>
+        </w:tc>
+        <w:tc>
+          <w:tcPr/>
+          <w:p>
+            <w:pPr>
+              <w:pStyle w:val="Compact"/>
+              <w:bidi w:val="1"/>
+              <w:spacing w:before="20" w:after="20" w:line="240" w:lineRule="auto"/>
+              <w:jc w:val="left"/>
+            </w:pPr>
+            <w:r>
+              <w:rPr>
+                <w:sz w:val="22"/>
+                <w:rtl/>
+                <w:szCs w:val="22"/>
+              </w:rPr>
+              <w:t xml:space="preserve">data.confirmatory_student_ids (purpose من قائمة بيضاء)</w:t>
             </w:r>
           </w:p>
         </w:tc>

</xml_diff>